<commit_message>
Remove em dashes from monday CSM cover letter
Replace em-dash punctuation in the opening and closing paragraphs
with commas; rebuilt PDF and DOCX (still one page).

Co-Authored-By: Claude Opus 4.8 <noreply@anthropic.com>
Claude-Session: https://claude.ai/code/session_01QaX3BGXdz82YqJsgLmNhmV
</commit_message>
<xml_diff>
--- a/applications/monday-customer-success-mid-market/cover-letter.docx
+++ b/applications/monday-customer-success-mid-market/cover-letter.docx
@@ -94,7 +94,7 @@
           <w:b w:val="0"/>
           <w:color w:val="1A1A1A"/>
         </w:rPr>
-        <w:t>The Technical CSM role you've described — moving customers beyond "tool adoption" into genuine business transformation by powering mission-critical workflows with AI — is the exact problem I spend my days solving. As founder of Solenzo, I architect and deploy autonomous, AI-driven systems for B2B clients, decomposing manual workflows into agent architectures that automate operations and generate insight. I'd bring that builder's fluency to monday.com's AI platform, and I'm a short drive from your Denver office for the hybrid schedule.</w:t>
+        <w:t>The Technical CSM role you've described, moving customers beyond "tool adoption" into genuine business transformation by powering mission-critical workflows with AI, is the exact problem I spend my days solving. As founder of Solenzo, I architect and deploy autonomous, AI-driven systems for B2B clients, decomposing manual workflows into agent architectures that automate operations and generate insight. I'd bring that builder's fluency to monday.com's AI platform, and I'm a short drive from your Denver office for the hybrid schedule.</w:t>
       </w:r>
     </w:p>
     <w:p>
@@ -120,7 +120,7 @@
           <w:b w:val="0"/>
           <w:color w:val="1A1A1A"/>
         </w:rPr>
-        <w:t>What sets me apart for this particular role is the combination monday.com is hiring for: a customer success consultant who actually understands how APIs work, how data flows between systems, and how to translate generative AI into measurable value — because I build those systems myself. I'd welcome the chance to discuss how I can help your mid-market customers turn the platform into real transformation. Thank you for your consideration.</w:t>
+        <w:t>What sets me apart for this particular role is the combination monday.com is hiring for: a customer success consultant who actually understands how APIs work, how data flows between systems, and how to translate generative AI into measurable value, because I build those systems myself. I'd welcome the chance to discuss how I can help your mid-market customers turn the platform into real transformation. Thank you for your consideration.</w:t>
       </w:r>
     </w:p>
     <w:p>

</xml_diff>